<commit_message>
docs: remove the version label from the execution evidence report cover (PDF, Word, Markdown)
</commit_message>
<xml_diff>
--- a/submission/StudyRoute_Execution_Evidence_Report.docx
+++ b/submission/StudyRoute_Execution_Evidence_Report.docx
@@ -41,7 +41,7 @@
     </w:p>
     <w:p>
       <w:r>
-        <w:t>SR-EVD-2026-01 | Version 1.0 | 18 October 2026</w:t>
+        <w:t>SR-EVD-2026-01 | 18 October 2026</w:t>
       </w:r>
     </w:p>
     <w:p>
@@ -143,7 +143,7 @@
         <w:rPr>
           <w:b w:val="0"/>
         </w:rPr>
-        <w:t>The execution evidence in this document (edition 1.0, 18 October 2026) is unchanged: every result and count below stands as written. This page adds read-only checks made later the same day, recorded in validation/final-verification.json (E07, produced by tools/final_verification.py), and supersedes edition 1.0's statement that the remote repository was not checked. The cover still reads Version 1.0; this page makes it edition 1.1.</w:t>
+        <w:t>The execution evidence in this document (edition 1.0, 18 October 2026) is unchanged: every result and count below stands as written. This page adds read-only checks made later the same day, recorded in validation/final-verification.json (E07, produced by tools/final_verification.py), and supersedes edition 1.0's statement that the remote repository was not checked. This page makes the document edition 1.1.</w:t>
       </w:r>
     </w:p>
     <w:tbl>

</xml_diff>

<commit_message>
docs: remove edition and version labels from the reports, the report covers, the package notes and the deck caption
</commit_message>
<xml_diff>
--- a/submission/StudyRoute_Execution_Evidence_Report.docx
+++ b/submission/StudyRoute_Execution_Evidence_Report.docx
@@ -54,7 +54,7 @@
     </w:p>
     <w:p>
       <w:r>
-        <w:t>00  Final-submission update (edition 1.1)</w:t>
+        <w:t>00  Final-submission update</w:t>
       </w:r>
     </w:p>
     <w:p>
@@ -127,7 +127,7 @@
         <w:pStyle w:val="Subtitle"/>
       </w:pPr>
       <w:r>
-        <w:t>00 / VERIFIED AFTER EDITION 1.0</w:t>
+        <w:t>00 / VERIFIED AFTER THE ORIGINAL ASSESSMENT</w:t>
       </w:r>
     </w:p>
     <w:p>
@@ -135,7 +135,7 @@
         <w:pStyle w:val="Heading1"/>
       </w:pPr>
       <w:r>
-        <w:t>Final-submission update (edition 1.1)</w:t>
+        <w:t>Final-submission update</w:t>
       </w:r>
     </w:p>
     <w:p>
@@ -143,7 +143,7 @@
         <w:rPr>
           <w:b w:val="0"/>
         </w:rPr>
-        <w:t>The execution evidence in this document (edition 1.0, 18 October 2026) is unchanged: every result and count below stands as written. This page adds read-only checks made later the same day, recorded in validation/final-verification.json (E07, produced by tools/final_verification.py), and supersedes edition 1.0's statement that the remote repository was not checked. This page makes the document edition 1.1.</w:t>
+        <w:t>The original execution evidence in this document (18 October 2026) is unchanged: every result and count below stands as written. This page adds read-only checks made later the same day, recorded in validation/final-verification.json (E07, produced by tools/final_verification.py), and supersedes the original statement that the remote repository was not checked. This page is the final-submission update.</w:t>
       </w:r>
     </w:p>
     <w:tbl>
@@ -216,7 +216,7 @@
               <w:spacing w:after="80"/>
             </w:pPr>
             <w:r>
-              <w:t>The remote main branch of NoobCrow/StudyRoute is commit bcce930ae0974712e922245878fd976b03a8938a, the commit this document covers. Edition 1.0 could not check the remote; this supersedes its statements that the remote HEAD was not checked. [E07]</w:t>
+              <w:t>The remote main branch of NoobCrow/StudyRoute is commit bcce930ae0974712e922245878fd976b03a8938a, the commit this document covers. The original assessment could not check the remote; this supersedes its statements that the remote HEAD was not checked. [E07]</w:t>
             </w:r>
           </w:p>
         </w:tc>
@@ -328,7 +328,7 @@
               <w:spacing w:after="80"/>
             </w:pPr>
             <w:r>
-              <w:t>backend/tests/test_explainer_model.py is skipped because its fixture, backend/tests/data/explainer_cases.json, is excluded by the repository's .gitignore rule data/: it is absent from the public repository and from the archive. A fresh clone therefore collects 1,673 tests, runs 1,672 and skips the explainer quality-floor tests, which is exactly the edition 1.0 result. Reconciled submission counts: 1,679 on a fixture-complete machine (1,678 pass, 1 skipped); fresh clone: 1,673 collected, 1,672 pass, 1 skip. This is a documentation count correction, not a new execution of the fixture-complete configuration. Adding the fixture to the repository is an open item for the maintainers and is not changed by this update. [E07]</w:t>
+              <w:t>backend/tests/test_explainer_model.py is skipped because its fixture, backend/tests/data/explainer_cases.json, is excluded by the repository's .gitignore rule data/: it is absent from the public repository and from the archive. A fresh clone therefore collects 1,673 tests, runs 1,672 and skips the explainer quality-floor tests, which is exactly the original result. Reconciled submission counts: 1,679 on a fixture-complete machine (1,678 pass, 1 skipped); fresh clone: 1,673 collected, 1,672 pass, 1 skip. This is a documentation count correction, not a new execution of the fixture-complete configuration. Adding the fixture to the repository is an open item for the maintainers and is not changed by this update. [E07]</w:t>
             </w:r>
           </w:p>
         </w:tc>
@@ -371,7 +371,7 @@
               <w:spacing w:after="80"/>
             </w:pPr>
             <w:r>
-              <w:t>Corrections to edition 1.0</w:t>
+              <w:t>Corrections to the original assessment</w:t>
             </w:r>
           </w:p>
         </w:tc>
@@ -1632,7 +1632,7 @@
         <w:rPr>
           <w:b w:val="0"/>
         </w:rPr>
-        <w:t>The archive ZIP comment supplies the commit identifier. Edition 1.1 checked it: the remote main branch is the same commit (E07). source-file-inventory.json records every original archived file’s length and SHA-256 before generated test caches are considered. Raw evidence is copied without rewriting outcomes. [E05]</w:t>
+        <w:t>The archive ZIP comment supplies the commit identifier. The final-submission update checked it: the remote main branch is the same commit (E07). source-file-inventory.json records every original archived file’s length and SHA-256 before generated test caches are considered. Raw evidence is copied without rewriting outcomes. [E05]</w:t>
       </w:r>
     </w:p>
     <w:p>
@@ -6178,7 +6178,7 @@
         <w:rPr>
           <w:b w:val="0"/>
         </w:rPr>
-        <w:t>The archive contains older summaries alongside detailed release records from different runs. A test count is meaningful only with its exact artifact, source snapshot and scope. This edition does not silently choose the largest number, combine overlapping runs or call supplied logs fresh. The freshly generated E01 JUnit is the primary current backend result. [H01–H04; E01]</w:t>
+        <w:t>The archive contains older summaries alongside detailed release records from different runs. A test count is meaningful only with its exact artifact, source snapshot and scope. This report does not silently choose the largest number, combine overlapping runs or call supplied logs fresh. The freshly generated E01 JUnit is the primary current backend result. [H01–H04; E01]</w:t>
       </w:r>
     </w:p>
     <w:p>

</xml_diff>

<commit_message>
docs: remove the red header line from every document; correct the notes' Q&A on test counts
- The red capitals header line above the contents and list pages is gone from the technical documentation, the
  security self-assessment and the execution evidence report (PDF and Word), from the Word header parts of all
  four documents, and from the front-page builder (submission/tools/front_matter.py). A search of 360 files,
  including both zips, finds no trace of it. The small footer phrase on body pages is unchanged.
- Deck speaker notes: the Q&A answer about test counts differing between machines was out of date (the fixture
  is committed); it now gives 1,705 / 1,704 / 1 skipped and says a fresh clone runs the same tests.
- Contents and list page numbers re-checked on the rebuilt files (63/63, 69/69, 13/13; PDFs and Word copies).
</commit_message>
<xml_diff>
--- a/submission/StudyRoute_Execution_Evidence_Report.docx
+++ b/submission/StudyRoute_Execution_Evidence_Report.docx
@@ -638,7 +638,7 @@
         </w:rPr>
         <w:fldChar w:fldCharType="separate"/>
       </w:r>
-      <w:hyperlink w:anchor="_Toc243332851" w:history="1">
+      <w:hyperlink w:anchor="_Toc243333385" w:history="1">
         <w:r>
           <w:rPr>
             <w:rStyle w:val="Hyperlink"/>
@@ -665,7 +665,7 @@
             <w:noProof/>
             <w:webHidden/>
           </w:rPr>
-          <w:instrText xml:space="preserve"> PAGEREF _Toc243332851 \h </w:instrText>
+          <w:instrText xml:space="preserve"> PAGEREF _Toc243333385 \h </w:instrText>
         </w:r>
         <w:r>
           <w:rPr>
@@ -710,7 +710,7 @@
           <w14:ligatures w14:val="standardContextual"/>
         </w:rPr>
       </w:pPr>
-      <w:hyperlink w:anchor="_Toc243332852" w:history="1">
+      <w:hyperlink w:anchor="_Toc243333386" w:history="1">
         <w:r>
           <w:rPr>
             <w:rStyle w:val="Hyperlink"/>
@@ -737,7 +737,7 @@
             <w:noProof/>
             <w:webHidden/>
           </w:rPr>
-          <w:instrText xml:space="preserve"> PAGEREF _Toc243332852 \h </w:instrText>
+          <w:instrText xml:space="preserve"> PAGEREF _Toc243333386 \h </w:instrText>
         </w:r>
         <w:r>
           <w:rPr>
@@ -782,7 +782,7 @@
           <w14:ligatures w14:val="standardContextual"/>
         </w:rPr>
       </w:pPr>
-      <w:hyperlink w:anchor="_Toc243332853" w:history="1">
+      <w:hyperlink w:anchor="_Toc243333387" w:history="1">
         <w:r>
           <w:rPr>
             <w:rStyle w:val="Hyperlink"/>
@@ -809,7 +809,7 @@
             <w:noProof/>
             <w:webHidden/>
           </w:rPr>
-          <w:instrText xml:space="preserve"> PAGEREF _Toc243332853 \h </w:instrText>
+          <w:instrText xml:space="preserve"> PAGEREF _Toc243333387 \h </w:instrText>
         </w:r>
         <w:r>
           <w:rPr>
@@ -854,7 +854,7 @@
           <w14:ligatures w14:val="standardContextual"/>
         </w:rPr>
       </w:pPr>
-      <w:hyperlink w:anchor="_Toc243332854" w:history="1">
+      <w:hyperlink w:anchor="_Toc243333388" w:history="1">
         <w:r>
           <w:rPr>
             <w:rStyle w:val="Hyperlink"/>
@@ -881,7 +881,7 @@
             <w:noProof/>
             <w:webHidden/>
           </w:rPr>
-          <w:instrText xml:space="preserve"> PAGEREF _Toc243332854 \h </w:instrText>
+          <w:instrText xml:space="preserve"> PAGEREF _Toc243333388 \h </w:instrText>
         </w:r>
         <w:r>
           <w:rPr>
@@ -926,7 +926,7 @@
           <w14:ligatures w14:val="standardContextual"/>
         </w:rPr>
       </w:pPr>
-      <w:hyperlink w:anchor="_Toc243332855" w:history="1">
+      <w:hyperlink w:anchor="_Toc243333389" w:history="1">
         <w:r>
           <w:rPr>
             <w:rStyle w:val="Hyperlink"/>
@@ -953,7 +953,7 @@
             <w:noProof/>
             <w:webHidden/>
           </w:rPr>
-          <w:instrText xml:space="preserve"> PAGEREF _Toc243332855 \h </w:instrText>
+          <w:instrText xml:space="preserve"> PAGEREF _Toc243333389 \h </w:instrText>
         </w:r>
         <w:r>
           <w:rPr>
@@ -998,7 +998,7 @@
           <w14:ligatures w14:val="standardContextual"/>
         </w:rPr>
       </w:pPr>
-      <w:hyperlink w:anchor="_Toc243332856" w:history="1">
+      <w:hyperlink w:anchor="_Toc243333390" w:history="1">
         <w:r>
           <w:rPr>
             <w:rStyle w:val="Hyperlink"/>
@@ -1025,7 +1025,7 @@
             <w:noProof/>
             <w:webHidden/>
           </w:rPr>
-          <w:instrText xml:space="preserve"> PAGEREF _Toc243332856 \h </w:instrText>
+          <w:instrText xml:space="preserve"> PAGEREF _Toc243333390 \h </w:instrText>
         </w:r>
         <w:r>
           <w:rPr>
@@ -1070,7 +1070,7 @@
           <w14:ligatures w14:val="standardContextual"/>
         </w:rPr>
       </w:pPr>
-      <w:hyperlink w:anchor="_Toc243332857" w:history="1">
+      <w:hyperlink w:anchor="_Toc243333391" w:history="1">
         <w:r>
           <w:rPr>
             <w:rStyle w:val="Hyperlink"/>
@@ -1097,7 +1097,7 @@
             <w:noProof/>
             <w:webHidden/>
           </w:rPr>
-          <w:instrText xml:space="preserve"> PAGEREF _Toc243332857 \h </w:instrText>
+          <w:instrText xml:space="preserve"> PAGEREF _Toc243333391 \h </w:instrText>
         </w:r>
         <w:r>
           <w:rPr>
@@ -1142,7 +1142,7 @@
           <w14:ligatures w14:val="standardContextual"/>
         </w:rPr>
       </w:pPr>
-      <w:hyperlink w:anchor="_Toc243332858" w:history="1">
+      <w:hyperlink w:anchor="_Toc243333392" w:history="1">
         <w:r>
           <w:rPr>
             <w:rStyle w:val="Hyperlink"/>
@@ -1169,7 +1169,7 @@
             <w:noProof/>
             <w:webHidden/>
           </w:rPr>
-          <w:instrText xml:space="preserve"> PAGEREF _Toc243332858 \h </w:instrText>
+          <w:instrText xml:space="preserve"> PAGEREF _Toc243333392 \h </w:instrText>
         </w:r>
         <w:r>
           <w:rPr>
@@ -1214,7 +1214,7 @@
           <w14:ligatures w14:val="standardContextual"/>
         </w:rPr>
       </w:pPr>
-      <w:hyperlink w:anchor="_Toc243332859" w:history="1">
+      <w:hyperlink w:anchor="_Toc243333393" w:history="1">
         <w:r>
           <w:rPr>
             <w:rStyle w:val="Hyperlink"/>
@@ -1241,7 +1241,7 @@
             <w:noProof/>
             <w:webHidden/>
           </w:rPr>
-          <w:instrText xml:space="preserve"> PAGEREF _Toc243332859 \h </w:instrText>
+          <w:instrText xml:space="preserve"> PAGEREF _Toc243333393 \h </w:instrText>
         </w:r>
         <w:r>
           <w:rPr>
@@ -1286,7 +1286,7 @@
           <w14:ligatures w14:val="standardContextual"/>
         </w:rPr>
       </w:pPr>
-      <w:hyperlink w:anchor="_Toc243332860" w:history="1">
+      <w:hyperlink w:anchor="_Toc243333394" w:history="1">
         <w:r>
           <w:rPr>
             <w:rStyle w:val="Hyperlink"/>
@@ -1313,7 +1313,7 @@
             <w:noProof/>
             <w:webHidden/>
           </w:rPr>
-          <w:instrText xml:space="preserve"> PAGEREF _Toc243332860 \h </w:instrText>
+          <w:instrText xml:space="preserve"> PAGEREF _Toc243333394 \h </w:instrText>
         </w:r>
         <w:r>
           <w:rPr>
@@ -1358,7 +1358,7 @@
           <w14:ligatures w14:val="standardContextual"/>
         </w:rPr>
       </w:pPr>
-      <w:hyperlink w:anchor="_Toc243332861" w:history="1">
+      <w:hyperlink w:anchor="_Toc243333395" w:history="1">
         <w:r>
           <w:rPr>
             <w:rStyle w:val="Hyperlink"/>
@@ -1385,7 +1385,7 @@
             <w:noProof/>
             <w:webHidden/>
           </w:rPr>
-          <w:instrText xml:space="preserve"> PAGEREF _Toc243332861 \h </w:instrText>
+          <w:instrText xml:space="preserve"> PAGEREF _Toc243333395 \h </w:instrText>
         </w:r>
         <w:r>
           <w:rPr>
@@ -1430,7 +1430,7 @@
           <w14:ligatures w14:val="standardContextual"/>
         </w:rPr>
       </w:pPr>
-      <w:hyperlink w:anchor="_Toc243332862" w:history="1">
+      <w:hyperlink w:anchor="_Toc243333396" w:history="1">
         <w:r>
           <w:rPr>
             <w:rStyle w:val="Hyperlink"/>
@@ -1457,7 +1457,7 @@
             <w:noProof/>
             <w:webHidden/>
           </w:rPr>
-          <w:instrText xml:space="preserve"> PAGEREF _Toc243332862 \h </w:instrText>
+          <w:instrText xml:space="preserve"> PAGEREF _Toc243333396 \h </w:instrText>
         </w:r>
         <w:r>
           <w:rPr>
@@ -1502,7 +1502,7 @@
           <w14:ligatures w14:val="standardContextual"/>
         </w:rPr>
       </w:pPr>
-      <w:hyperlink w:anchor="_Toc243332863" w:history="1">
+      <w:hyperlink w:anchor="_Toc243333397" w:history="1">
         <w:r>
           <w:rPr>
             <w:rStyle w:val="Hyperlink"/>
@@ -1529,7 +1529,7 @@
             <w:noProof/>
             <w:webHidden/>
           </w:rPr>
-          <w:instrText xml:space="preserve"> PAGEREF _Toc243332863 \h </w:instrText>
+          <w:instrText xml:space="preserve"> PAGEREF _Toc243333397 \h </w:instrText>
         </w:r>
         <w:r>
           <w:rPr>
@@ -1608,7 +1608,7 @@
       <w:pPr>
         <w:pStyle w:val="Heading1"/>
       </w:pPr>
-      <w:bookmarkStart w:id="0" w:name="_Toc243332851"/>
+      <w:bookmarkStart w:id="0" w:name="_Toc243333385"/>
       <w:r>
         <w:t>Final-submission update</w:t>
       </w:r>
@@ -1940,7 +1940,7 @@
       <w:pPr>
         <w:pStyle w:val="Heading1"/>
       </w:pPr>
-      <w:bookmarkStart w:id="1" w:name="_Toc243332852"/>
+      <w:bookmarkStart w:id="1" w:name="_Toc243333386"/>
       <w:r>
         <w:t>Evidence at a glance</w:t>
       </w:r>
@@ -2545,7 +2545,7 @@
       <w:pPr>
         <w:pStyle w:val="Heading1"/>
       </w:pPr>
-      <w:bookmarkStart w:id="2" w:name="_Toc243332853"/>
+      <w:bookmarkStart w:id="2" w:name="_Toc243333387"/>
       <w:r>
         <w:t>Provenance &amp; evidence taxonomy</w:t>
       </w:r>
@@ -3165,7 +3165,7 @@
       <w:pPr>
         <w:pStyle w:val="Heading1"/>
       </w:pPr>
-      <w:bookmarkStart w:id="3" w:name="_Toc243332854"/>
+      <w:bookmarkStart w:id="3" w:name="_Toc243333388"/>
       <w:r>
         <w:t>Environment &amp; repeatability</w:t>
       </w:r>
@@ -3618,7 +3618,7 @@
       <w:pPr>
         <w:pStyle w:val="Heading1"/>
       </w:pPr>
-      <w:bookmarkStart w:id="4" w:name="_Toc243332855"/>
+      <w:bookmarkStart w:id="4" w:name="_Toc243333389"/>
       <w:r>
         <w:t>Backend regression results</w:t>
       </w:r>
@@ -4109,7 +4109,7 @@
       <w:pPr>
         <w:pStyle w:val="Heading1"/>
       </w:pPr>
-      <w:bookmarkStart w:id="5" w:name="_Toc243332856"/>
+      <w:bookmarkStart w:id="5" w:name="_Toc243333390"/>
       <w:r>
         <w:t>Demonstration: preparation &amp; approval</w:t>
       </w:r>
@@ -4714,7 +4714,7 @@
       <w:pPr>
         <w:pStyle w:val="Heading1"/>
       </w:pPr>
-      <w:bookmarkStart w:id="6" w:name="_Toc243332857"/>
+      <w:bookmarkStart w:id="6" w:name="_Toc243333391"/>
       <w:r>
         <w:t>Demonstration: settlement &amp; integrity</w:t>
       </w:r>
@@ -5130,7 +5130,7 @@
           <w:noProof/>
         </w:rPr>
         <w:drawing>
-          <wp:inline distT="0" distB="0" distL="0" distR="0" wp14:anchorId="0715B065" wp14:editId="661CCF15">
+          <wp:inline distT="0" distB="0" distL="0" distR="0" wp14:anchorId="40DB6A9F" wp14:editId="3C96373E">
             <wp:extent cx="6217920" cy="1575206"/>
             <wp:effectExtent l="0" t="0" r="0" b="0"/>
             <wp:docPr id="1" name="Picture 1"/>
@@ -5218,7 +5218,7 @@
       <w:pPr>
         <w:pStyle w:val="Heading1"/>
       </w:pPr>
-      <w:bookmarkStart w:id="7" w:name="_Toc243332858"/>
+      <w:bookmarkStart w:id="7" w:name="_Toc243333392"/>
       <w:r>
         <w:t>Audit experiment &amp; independent check</w:t>
       </w:r>
@@ -5665,7 +5665,7 @@
       <w:pPr>
         <w:pStyle w:val="Heading1"/>
       </w:pPr>
-      <w:bookmarkStart w:id="8" w:name="_Toc243332859"/>
+      <w:bookmarkStart w:id="8" w:name="_Toc243333393"/>
       <w:r>
         <w:t>Ledger &amp; escrow invariants</w:t>
       </w:r>
@@ -6566,7 +6566,7 @@
       <w:pPr>
         <w:pStyle w:val="Heading1"/>
       </w:pPr>
-      <w:bookmarkStart w:id="9" w:name="_Toc243332860"/>
+      <w:bookmarkStart w:id="9" w:name="_Toc243333394"/>
       <w:r>
         <w:t>AI behavior: evidence without overclaim</w:t>
       </w:r>
@@ -7085,7 +7085,7 @@
       <w:pPr>
         <w:pStyle w:val="Heading1"/>
       </w:pPr>
-      <w:bookmarkStart w:id="10" w:name="_Toc243332861"/>
+      <w:bookmarkStart w:id="10" w:name="_Toc243333395"/>
       <w:r>
         <w:t>Historical evidence &amp; reconciliation</w:t>
       </w:r>
@@ -7658,7 +7658,7 @@
       <w:pPr>
         <w:pStyle w:val="Heading1"/>
       </w:pPr>
-      <w:bookmarkStart w:id="11" w:name="_Toc243332862"/>
+      <w:bookmarkStart w:id="11" w:name="_Toc243333396"/>
       <w:r>
         <w:t>Reproduction procedure</w:t>
       </w:r>
@@ -7871,7 +7871,7 @@
       <w:pPr>
         <w:pStyle w:val="Heading1"/>
       </w:pPr>
-      <w:bookmarkStart w:id="12" w:name="_Toc243332863"/>
+      <w:bookmarkStart w:id="12" w:name="_Toc243333397"/>
       <w:r>
         <w:t>Evidence index &amp; acceptance boundary</w:t>
       </w:r>
@@ -8465,26 +8465,7 @@
   <w:p>
     <w:pPr>
       <w:pStyle w:val="Header"/>
-      <w:pBdr>
-        <w:bottom w:val="single" w:sz="8" w:space="0" w:color="000000"/>
-      </w:pBdr>
-      <w:jc w:val="center"/>
-      <w:rPr>
-        <w:rFonts w:ascii="Times New Roman" w:hAnsi="Times New Roman" w:cs="Times New Roman"/>
-        <w:b/>
-        <w:color w:val="E00000"/>
-        <w:sz w:val="23"/>
-      </w:rPr>
     </w:pPr>
-    <w:r>
-      <w:rPr>
-        <w:rFonts w:ascii="Times New Roman" w:hAnsi="Times New Roman" w:cs="Times New Roman"/>
-        <w:b/>
-        <w:color w:val="E00000"/>
-        <w:sz w:val="23"/>
-      </w:rPr>
-      <w:t>SYNTHETIC DATA – NOT PRODUCTION ASSURANCE</w:t>
-    </w:r>
   </w:p>
 </w:hdr>
 </file>
@@ -8494,26 +8475,7 @@
   <w:p>
     <w:pPr>
       <w:pStyle w:val="Header"/>
-      <w:pBdr>
-        <w:bottom w:val="single" w:sz="8" w:space="0" w:color="000000"/>
-      </w:pBdr>
-      <w:jc w:val="center"/>
-      <w:rPr>
-        <w:rFonts w:ascii="Times New Roman" w:hAnsi="Times New Roman" w:cs="Times New Roman"/>
-        <w:b/>
-        <w:color w:val="E00000"/>
-        <w:sz w:val="23"/>
-      </w:rPr>
     </w:pPr>
-    <w:r>
-      <w:rPr>
-        <w:rFonts w:ascii="Times New Roman" w:hAnsi="Times New Roman" w:cs="Times New Roman"/>
-        <w:b/>
-        <w:color w:val="E00000"/>
-        <w:sz w:val="23"/>
-      </w:rPr>
-      <w:t>SYNTHETIC DATA – NOT PRODUCTION ASSURANCE</w:t>
-    </w:r>
   </w:p>
 </w:hdr>
 </file>
@@ -8523,13 +8485,6 @@
   <w:p>
     <w:pPr>
       <w:pStyle w:val="Header"/>
-      <w:jc w:val="center"/>
-      <w:rPr>
-        <w:rFonts w:ascii="Times New Roman" w:hAnsi="Times New Roman" w:cs="Times New Roman"/>
-        <w:b/>
-        <w:color w:val="E00000"/>
-        <w:sz w:val="23"/>
-      </w:rPr>
     </w:pPr>
   </w:p>
 </w:hdr>
@@ -8744,31 +8699,31 @@
       </w:rPr>
     </w:lvl>
   </w:abstractNum>
-  <w:num w:numId="1" w16cid:durableId="381055247">
+  <w:num w:numId="1" w16cid:durableId="437337689">
     <w:abstractNumId w:val="8"/>
   </w:num>
-  <w:num w:numId="2" w16cid:durableId="2031490375">
+  <w:num w:numId="2" w16cid:durableId="1108085298">
     <w:abstractNumId w:val="6"/>
   </w:num>
-  <w:num w:numId="3" w16cid:durableId="1694072131">
+  <w:num w:numId="3" w16cid:durableId="1297375992">
     <w:abstractNumId w:val="5"/>
   </w:num>
-  <w:num w:numId="4" w16cid:durableId="954209888">
+  <w:num w:numId="4" w16cid:durableId="1221675303">
     <w:abstractNumId w:val="4"/>
   </w:num>
-  <w:num w:numId="5" w16cid:durableId="911617302">
+  <w:num w:numId="5" w16cid:durableId="1145858403">
     <w:abstractNumId w:val="7"/>
   </w:num>
-  <w:num w:numId="6" w16cid:durableId="2041346970">
+  <w:num w:numId="6" w16cid:durableId="1526671669">
     <w:abstractNumId w:val="3"/>
   </w:num>
-  <w:num w:numId="7" w16cid:durableId="1022434416">
+  <w:num w:numId="7" w16cid:durableId="1555459360">
     <w:abstractNumId w:val="2"/>
   </w:num>
-  <w:num w:numId="8" w16cid:durableId="940376450">
+  <w:num w:numId="8" w16cid:durableId="54550387">
     <w:abstractNumId w:val="1"/>
   </w:num>
-  <w:num w:numId="9" w16cid:durableId="152141573">
+  <w:num w:numId="9" w16cid:durableId="1942450331">
     <w:abstractNumId w:val="0"/>
   </w:num>
 </w:numbering>
@@ -20165,7 +20120,7 @@
     <w:name w:val="Table Caption"/>
     <w:basedOn w:val="Normal"/>
     <w:link w:val="TableCaptionChar"/>
-    <w:rsid w:val="009D304B"/>
+    <w:rsid w:val="00FC5E9F"/>
     <w:pPr>
       <w:keepNext/>
       <w:spacing w:before="160" w:after="60"/>
@@ -20183,7 +20138,7 @@
     <w:name w:val="Table Caption Char"/>
     <w:basedOn w:val="SubtitleChar"/>
     <w:link w:val="TableCaption"/>
-    <w:rsid w:val="009D304B"/>
+    <w:rsid w:val="00FC5E9F"/>
     <w:rPr>
       <w:rFonts w:ascii="Arial" w:eastAsiaTheme="majorEastAsia" w:hAnsi="Arial" w:cs="Arial"/>
       <w:b/>
@@ -20199,7 +20154,7 @@
     <w:name w:val="Figure Caption"/>
     <w:basedOn w:val="Normal"/>
     <w:link w:val="FigureCaptionChar"/>
-    <w:rsid w:val="009D304B"/>
+    <w:rsid w:val="00FC5E9F"/>
     <w:pPr>
       <w:spacing w:before="40" w:after="200"/>
       <w:jc w:val="center"/>
@@ -20217,7 +20172,7 @@
     <w:name w:val="Figure Caption Char"/>
     <w:basedOn w:val="SubtitleChar"/>
     <w:link w:val="FigureCaption"/>
-    <w:rsid w:val="009D304B"/>
+    <w:rsid w:val="00FC5E9F"/>
     <w:rPr>
       <w:rFonts w:ascii="Arial" w:eastAsiaTheme="majorEastAsia" w:hAnsi="Arial" w:cs="Arial"/>
       <w:b/>
@@ -20234,7 +20189,7 @@
     <w:basedOn w:val="DefaultParagraphFont"/>
     <w:uiPriority w:val="99"/>
     <w:unhideWhenUsed/>
-    <w:rsid w:val="009D304B"/>
+    <w:rsid w:val="00FC5E9F"/>
     <w:rPr>
       <w:color w:val="0000FF" w:themeColor="hyperlink"/>
       <w:u w:val="single"/>
@@ -20246,7 +20201,7 @@
     <w:uiPriority w:val="99"/>
     <w:semiHidden/>
     <w:unhideWhenUsed/>
-    <w:rsid w:val="009D304B"/>
+    <w:rsid w:val="00FC5E9F"/>
     <w:rPr>
       <w:color w:val="605E5C"/>
       <w:shd w:val="clear" w:color="auto" w:fill="E1DFDD"/>
@@ -20259,7 +20214,7 @@
     <w:autoRedefine/>
     <w:uiPriority w:val="39"/>
     <w:unhideWhenUsed/>
-    <w:rsid w:val="009D304B"/>
+    <w:rsid w:val="00FC5E9F"/>
     <w:pPr>
       <w:tabs>
         <w:tab w:val="right" w:leader="dot" w:pos="9109"/>
@@ -20280,7 +20235,7 @@
     <w:uiPriority w:val="39"/>
     <w:semiHidden/>
     <w:unhideWhenUsed/>
-    <w:rsid w:val="009D304B"/>
+    <w:rsid w:val="00FC5E9F"/>
     <w:pPr>
       <w:tabs>
         <w:tab w:val="right" w:leader="dot" w:pos="9109"/>
@@ -20302,7 +20257,7 @@
     <w:uiPriority w:val="39"/>
     <w:semiHidden/>
     <w:unhideWhenUsed/>
-    <w:rsid w:val="009D304B"/>
+    <w:rsid w:val="00FC5E9F"/>
     <w:pPr>
       <w:tabs>
         <w:tab w:val="right" w:leader="dot" w:pos="9109"/>
@@ -20324,7 +20279,7 @@
     <w:uiPriority w:val="39"/>
     <w:semiHidden/>
     <w:unhideWhenUsed/>
-    <w:rsid w:val="009D304B"/>
+    <w:rsid w:val="00FC5E9F"/>
     <w:pPr>
       <w:tabs>
         <w:tab w:val="right" w:leader="dot" w:pos="9109"/>

</xml_diff>

<commit_message>
docs: number the execution report's first body page; rebuild the packaged copies
The execution report's first body page had no header or footer (a leftover first-page setting from its old
title page), so the contents page's "page 1" showed no number. It now carries the same header and footer as
every other body page. Release manifest, source archive, evidence pack and checksums regenerated.
</commit_message>
<xml_diff>
--- a/submission/StudyRoute_Execution_Evidence_Report.docx
+++ b/submission/StudyRoute_Execution_Evidence_Report.docx
@@ -638,7 +638,7 @@
         </w:rPr>
         <w:fldChar w:fldCharType="separate"/>
       </w:r>
-      <w:hyperlink w:anchor="_Toc243333385" w:history="1">
+      <w:hyperlink w:anchor="_Toc243333727" w:history="1">
         <w:r>
           <w:rPr>
             <w:rStyle w:val="Hyperlink"/>
@@ -665,7 +665,7 @@
             <w:noProof/>
             <w:webHidden/>
           </w:rPr>
-          <w:instrText xml:space="preserve"> PAGEREF _Toc243333385 \h </w:instrText>
+          <w:instrText xml:space="preserve"> PAGEREF _Toc243333727 \h </w:instrText>
         </w:r>
         <w:r>
           <w:rPr>
@@ -710,7 +710,7 @@
           <w14:ligatures w14:val="standardContextual"/>
         </w:rPr>
       </w:pPr>
-      <w:hyperlink w:anchor="_Toc243333386" w:history="1">
+      <w:hyperlink w:anchor="_Toc243333728" w:history="1">
         <w:r>
           <w:rPr>
             <w:rStyle w:val="Hyperlink"/>
@@ -737,7 +737,7 @@
             <w:noProof/>
             <w:webHidden/>
           </w:rPr>
-          <w:instrText xml:space="preserve"> PAGEREF _Toc243333386 \h </w:instrText>
+          <w:instrText xml:space="preserve"> PAGEREF _Toc243333728 \h </w:instrText>
         </w:r>
         <w:r>
           <w:rPr>
@@ -782,7 +782,7 @@
           <w14:ligatures w14:val="standardContextual"/>
         </w:rPr>
       </w:pPr>
-      <w:hyperlink w:anchor="_Toc243333387" w:history="1">
+      <w:hyperlink w:anchor="_Toc243333729" w:history="1">
         <w:r>
           <w:rPr>
             <w:rStyle w:val="Hyperlink"/>
@@ -809,7 +809,7 @@
             <w:noProof/>
             <w:webHidden/>
           </w:rPr>
-          <w:instrText xml:space="preserve"> PAGEREF _Toc243333387 \h </w:instrText>
+          <w:instrText xml:space="preserve"> PAGEREF _Toc243333729 \h </w:instrText>
         </w:r>
         <w:r>
           <w:rPr>
@@ -854,7 +854,7 @@
           <w14:ligatures w14:val="standardContextual"/>
         </w:rPr>
       </w:pPr>
-      <w:hyperlink w:anchor="_Toc243333388" w:history="1">
+      <w:hyperlink w:anchor="_Toc243333730" w:history="1">
         <w:r>
           <w:rPr>
             <w:rStyle w:val="Hyperlink"/>
@@ -881,7 +881,7 @@
             <w:noProof/>
             <w:webHidden/>
           </w:rPr>
-          <w:instrText xml:space="preserve"> PAGEREF _Toc243333388 \h </w:instrText>
+          <w:instrText xml:space="preserve"> PAGEREF _Toc243333730 \h </w:instrText>
         </w:r>
         <w:r>
           <w:rPr>
@@ -926,7 +926,7 @@
           <w14:ligatures w14:val="standardContextual"/>
         </w:rPr>
       </w:pPr>
-      <w:hyperlink w:anchor="_Toc243333389" w:history="1">
+      <w:hyperlink w:anchor="_Toc243333731" w:history="1">
         <w:r>
           <w:rPr>
             <w:rStyle w:val="Hyperlink"/>
@@ -953,7 +953,7 @@
             <w:noProof/>
             <w:webHidden/>
           </w:rPr>
-          <w:instrText xml:space="preserve"> PAGEREF _Toc243333389 \h </w:instrText>
+          <w:instrText xml:space="preserve"> PAGEREF _Toc243333731 \h </w:instrText>
         </w:r>
         <w:r>
           <w:rPr>
@@ -998,7 +998,7 @@
           <w14:ligatures w14:val="standardContextual"/>
         </w:rPr>
       </w:pPr>
-      <w:hyperlink w:anchor="_Toc243333390" w:history="1">
+      <w:hyperlink w:anchor="_Toc243333732" w:history="1">
         <w:r>
           <w:rPr>
             <w:rStyle w:val="Hyperlink"/>
@@ -1025,7 +1025,7 @@
             <w:noProof/>
             <w:webHidden/>
           </w:rPr>
-          <w:instrText xml:space="preserve"> PAGEREF _Toc243333390 \h </w:instrText>
+          <w:instrText xml:space="preserve"> PAGEREF _Toc243333732 \h </w:instrText>
         </w:r>
         <w:r>
           <w:rPr>
@@ -1070,7 +1070,7 @@
           <w14:ligatures w14:val="standardContextual"/>
         </w:rPr>
       </w:pPr>
-      <w:hyperlink w:anchor="_Toc243333391" w:history="1">
+      <w:hyperlink w:anchor="_Toc243333733" w:history="1">
         <w:r>
           <w:rPr>
             <w:rStyle w:val="Hyperlink"/>
@@ -1097,7 +1097,7 @@
             <w:noProof/>
             <w:webHidden/>
           </w:rPr>
-          <w:instrText xml:space="preserve"> PAGEREF _Toc243333391 \h </w:instrText>
+          <w:instrText xml:space="preserve"> PAGEREF _Toc243333733 \h </w:instrText>
         </w:r>
         <w:r>
           <w:rPr>
@@ -1142,7 +1142,7 @@
           <w14:ligatures w14:val="standardContextual"/>
         </w:rPr>
       </w:pPr>
-      <w:hyperlink w:anchor="_Toc243333392" w:history="1">
+      <w:hyperlink w:anchor="_Toc243333734" w:history="1">
         <w:r>
           <w:rPr>
             <w:rStyle w:val="Hyperlink"/>
@@ -1169,7 +1169,7 @@
             <w:noProof/>
             <w:webHidden/>
           </w:rPr>
-          <w:instrText xml:space="preserve"> PAGEREF _Toc243333392 \h </w:instrText>
+          <w:instrText xml:space="preserve"> PAGEREF _Toc243333734 \h </w:instrText>
         </w:r>
         <w:r>
           <w:rPr>
@@ -1214,7 +1214,7 @@
           <w14:ligatures w14:val="standardContextual"/>
         </w:rPr>
       </w:pPr>
-      <w:hyperlink w:anchor="_Toc243333393" w:history="1">
+      <w:hyperlink w:anchor="_Toc243333735" w:history="1">
         <w:r>
           <w:rPr>
             <w:rStyle w:val="Hyperlink"/>
@@ -1241,7 +1241,7 @@
             <w:noProof/>
             <w:webHidden/>
           </w:rPr>
-          <w:instrText xml:space="preserve"> PAGEREF _Toc243333393 \h </w:instrText>
+          <w:instrText xml:space="preserve"> PAGEREF _Toc243333735 \h </w:instrText>
         </w:r>
         <w:r>
           <w:rPr>
@@ -1286,7 +1286,7 @@
           <w14:ligatures w14:val="standardContextual"/>
         </w:rPr>
       </w:pPr>
-      <w:hyperlink w:anchor="_Toc243333394" w:history="1">
+      <w:hyperlink w:anchor="_Toc243333736" w:history="1">
         <w:r>
           <w:rPr>
             <w:rStyle w:val="Hyperlink"/>
@@ -1313,7 +1313,7 @@
             <w:noProof/>
             <w:webHidden/>
           </w:rPr>
-          <w:instrText xml:space="preserve"> PAGEREF _Toc243333394 \h </w:instrText>
+          <w:instrText xml:space="preserve"> PAGEREF _Toc243333736 \h </w:instrText>
         </w:r>
         <w:r>
           <w:rPr>
@@ -1358,7 +1358,7 @@
           <w14:ligatures w14:val="standardContextual"/>
         </w:rPr>
       </w:pPr>
-      <w:hyperlink w:anchor="_Toc243333395" w:history="1">
+      <w:hyperlink w:anchor="_Toc243333737" w:history="1">
         <w:r>
           <w:rPr>
             <w:rStyle w:val="Hyperlink"/>
@@ -1385,7 +1385,7 @@
             <w:noProof/>
             <w:webHidden/>
           </w:rPr>
-          <w:instrText xml:space="preserve"> PAGEREF _Toc243333395 \h </w:instrText>
+          <w:instrText xml:space="preserve"> PAGEREF _Toc243333737 \h </w:instrText>
         </w:r>
         <w:r>
           <w:rPr>
@@ -1430,7 +1430,7 @@
           <w14:ligatures w14:val="standardContextual"/>
         </w:rPr>
       </w:pPr>
-      <w:hyperlink w:anchor="_Toc243333396" w:history="1">
+      <w:hyperlink w:anchor="_Toc243333738" w:history="1">
         <w:r>
           <w:rPr>
             <w:rStyle w:val="Hyperlink"/>
@@ -1457,7 +1457,7 @@
             <w:noProof/>
             <w:webHidden/>
           </w:rPr>
-          <w:instrText xml:space="preserve"> PAGEREF _Toc243333396 \h </w:instrText>
+          <w:instrText xml:space="preserve"> PAGEREF _Toc243333738 \h </w:instrText>
         </w:r>
         <w:r>
           <w:rPr>
@@ -1502,7 +1502,7 @@
           <w14:ligatures w14:val="standardContextual"/>
         </w:rPr>
       </w:pPr>
-      <w:hyperlink w:anchor="_Toc243333397" w:history="1">
+      <w:hyperlink w:anchor="_Toc243333739" w:history="1">
         <w:r>
           <w:rPr>
             <w:rStyle w:val="Hyperlink"/>
@@ -1529,7 +1529,7 @@
             <w:noProof/>
             <w:webHidden/>
           </w:rPr>
-          <w:instrText xml:space="preserve"> PAGEREF _Toc243333397 \h </w:instrText>
+          <w:instrText xml:space="preserve"> PAGEREF _Toc243333739 \h </w:instrText>
         </w:r>
         <w:r>
           <w:rPr>
@@ -1608,7 +1608,7 @@
       <w:pPr>
         <w:pStyle w:val="Heading1"/>
       </w:pPr>
-      <w:bookmarkStart w:id="0" w:name="_Toc243333385"/>
+      <w:bookmarkStart w:id="0" w:name="_Toc243333727"/>
       <w:r>
         <w:t>Final-submission update</w:t>
       </w:r>
@@ -1940,7 +1940,7 @@
       <w:pPr>
         <w:pStyle w:val="Heading1"/>
       </w:pPr>
-      <w:bookmarkStart w:id="1" w:name="_Toc243333386"/>
+      <w:bookmarkStart w:id="1" w:name="_Toc243333728"/>
       <w:r>
         <w:t>Evidence at a glance</w:t>
       </w:r>
@@ -2545,7 +2545,7 @@
       <w:pPr>
         <w:pStyle w:val="Heading1"/>
       </w:pPr>
-      <w:bookmarkStart w:id="2" w:name="_Toc243333387"/>
+      <w:bookmarkStart w:id="2" w:name="_Toc243333729"/>
       <w:r>
         <w:t>Provenance &amp; evidence taxonomy</w:t>
       </w:r>
@@ -3165,7 +3165,7 @@
       <w:pPr>
         <w:pStyle w:val="Heading1"/>
       </w:pPr>
-      <w:bookmarkStart w:id="3" w:name="_Toc243333388"/>
+      <w:bookmarkStart w:id="3" w:name="_Toc243333730"/>
       <w:r>
         <w:t>Environment &amp; repeatability</w:t>
       </w:r>
@@ -3618,7 +3618,7 @@
       <w:pPr>
         <w:pStyle w:val="Heading1"/>
       </w:pPr>
-      <w:bookmarkStart w:id="4" w:name="_Toc243333389"/>
+      <w:bookmarkStart w:id="4" w:name="_Toc243333731"/>
       <w:r>
         <w:t>Backend regression results</w:t>
       </w:r>
@@ -4109,7 +4109,7 @@
       <w:pPr>
         <w:pStyle w:val="Heading1"/>
       </w:pPr>
-      <w:bookmarkStart w:id="5" w:name="_Toc243333390"/>
+      <w:bookmarkStart w:id="5" w:name="_Toc243333732"/>
       <w:r>
         <w:t>Demonstration: preparation &amp; approval</w:t>
       </w:r>
@@ -4714,7 +4714,7 @@
       <w:pPr>
         <w:pStyle w:val="Heading1"/>
       </w:pPr>
-      <w:bookmarkStart w:id="6" w:name="_Toc243333391"/>
+      <w:bookmarkStart w:id="6" w:name="_Toc243333733"/>
       <w:r>
         <w:t>Demonstration: settlement &amp; integrity</w:t>
       </w:r>
@@ -5130,7 +5130,7 @@
           <w:noProof/>
         </w:rPr>
         <w:drawing>
-          <wp:inline distT="0" distB="0" distL="0" distR="0" wp14:anchorId="40DB6A9F" wp14:editId="3C96373E">
+          <wp:inline distT="0" distB="0" distL="0" distR="0" wp14:anchorId="437F80B9" wp14:editId="0D7A1A2B">
             <wp:extent cx="6217920" cy="1575206"/>
             <wp:effectExtent l="0" t="0" r="0" b="0"/>
             <wp:docPr id="1" name="Picture 1"/>
@@ -5218,7 +5218,7 @@
       <w:pPr>
         <w:pStyle w:val="Heading1"/>
       </w:pPr>
-      <w:bookmarkStart w:id="7" w:name="_Toc243333392"/>
+      <w:bookmarkStart w:id="7" w:name="_Toc243333734"/>
       <w:r>
         <w:t>Audit experiment &amp; independent check</w:t>
       </w:r>
@@ -5665,7 +5665,7 @@
       <w:pPr>
         <w:pStyle w:val="Heading1"/>
       </w:pPr>
-      <w:bookmarkStart w:id="8" w:name="_Toc243333393"/>
+      <w:bookmarkStart w:id="8" w:name="_Toc243333735"/>
       <w:r>
         <w:t>Ledger &amp; escrow invariants</w:t>
       </w:r>
@@ -6566,7 +6566,7 @@
       <w:pPr>
         <w:pStyle w:val="Heading1"/>
       </w:pPr>
-      <w:bookmarkStart w:id="9" w:name="_Toc243333394"/>
+      <w:bookmarkStart w:id="9" w:name="_Toc243333736"/>
       <w:r>
         <w:t>AI behavior: evidence without overclaim</w:t>
       </w:r>
@@ -7085,7 +7085,7 @@
       <w:pPr>
         <w:pStyle w:val="Heading1"/>
       </w:pPr>
-      <w:bookmarkStart w:id="10" w:name="_Toc243333395"/>
+      <w:bookmarkStart w:id="10" w:name="_Toc243333737"/>
       <w:r>
         <w:t>Historical evidence &amp; reconciliation</w:t>
       </w:r>
@@ -7658,7 +7658,7 @@
       <w:pPr>
         <w:pStyle w:val="Heading1"/>
       </w:pPr>
-      <w:bookmarkStart w:id="11" w:name="_Toc243333396"/>
+      <w:bookmarkStart w:id="11" w:name="_Toc243333738"/>
       <w:r>
         <w:t>Reproduction procedure</w:t>
       </w:r>
@@ -7871,7 +7871,7 @@
       <w:pPr>
         <w:pStyle w:val="Heading1"/>
       </w:pPr>
-      <w:bookmarkStart w:id="12" w:name="_Toc243333397"/>
+      <w:bookmarkStart w:id="12" w:name="_Toc243333739"/>
       <w:r>
         <w:t>Evidence index &amp; acceptance boundary</w:t>
       </w:r>
@@ -8248,7 +8248,6 @@
       <w:pgMar w:top="1080" w:right="1008" w:bottom="1008" w:left="1008" w:header="720" w:footer="720" w:gutter="0"/>
       <w:pgNumType w:start="1"/>
       <w:cols w:space="720"/>
-      <w:titlePg/>
       <w:docGrid w:linePitch="360"/>
     </w:sectPr>
   </w:body>
@@ -8699,31 +8698,31 @@
       </w:rPr>
     </w:lvl>
   </w:abstractNum>
-  <w:num w:numId="1" w16cid:durableId="437337689">
+  <w:num w:numId="1" w16cid:durableId="1454637301">
     <w:abstractNumId w:val="8"/>
   </w:num>
-  <w:num w:numId="2" w16cid:durableId="1108085298">
+  <w:num w:numId="2" w16cid:durableId="98261096">
     <w:abstractNumId w:val="6"/>
   </w:num>
-  <w:num w:numId="3" w16cid:durableId="1297375992">
+  <w:num w:numId="3" w16cid:durableId="1739160403">
     <w:abstractNumId w:val="5"/>
   </w:num>
-  <w:num w:numId="4" w16cid:durableId="1221675303">
+  <w:num w:numId="4" w16cid:durableId="149446506">
     <w:abstractNumId w:val="4"/>
   </w:num>
-  <w:num w:numId="5" w16cid:durableId="1145858403">
+  <w:num w:numId="5" w16cid:durableId="310182166">
     <w:abstractNumId w:val="7"/>
   </w:num>
-  <w:num w:numId="6" w16cid:durableId="1526671669">
+  <w:num w:numId="6" w16cid:durableId="504325945">
     <w:abstractNumId w:val="3"/>
   </w:num>
-  <w:num w:numId="7" w16cid:durableId="1555459360">
+  <w:num w:numId="7" w16cid:durableId="675302132">
     <w:abstractNumId w:val="2"/>
   </w:num>
-  <w:num w:numId="8" w16cid:durableId="54550387">
+  <w:num w:numId="8" w16cid:durableId="1436898883">
     <w:abstractNumId w:val="1"/>
   </w:num>
-  <w:num w:numId="9" w16cid:durableId="1942450331">
+  <w:num w:numId="9" w16cid:durableId="239364133">
     <w:abstractNumId w:val="0"/>
   </w:num>
 </w:numbering>
@@ -20120,7 +20119,7 @@
     <w:name w:val="Table Caption"/>
     <w:basedOn w:val="Normal"/>
     <w:link w:val="TableCaptionChar"/>
-    <w:rsid w:val="00FC5E9F"/>
+    <w:rsid w:val="005D727E"/>
     <w:pPr>
       <w:keepNext/>
       <w:spacing w:before="160" w:after="60"/>
@@ -20138,7 +20137,7 @@
     <w:name w:val="Table Caption Char"/>
     <w:basedOn w:val="SubtitleChar"/>
     <w:link w:val="TableCaption"/>
-    <w:rsid w:val="00FC5E9F"/>
+    <w:rsid w:val="005D727E"/>
     <w:rPr>
       <w:rFonts w:ascii="Arial" w:eastAsiaTheme="majorEastAsia" w:hAnsi="Arial" w:cs="Arial"/>
       <w:b/>
@@ -20154,7 +20153,7 @@
     <w:name w:val="Figure Caption"/>
     <w:basedOn w:val="Normal"/>
     <w:link w:val="FigureCaptionChar"/>
-    <w:rsid w:val="00FC5E9F"/>
+    <w:rsid w:val="005D727E"/>
     <w:pPr>
       <w:spacing w:before="40" w:after="200"/>
       <w:jc w:val="center"/>
@@ -20172,7 +20171,7 @@
     <w:name w:val="Figure Caption Char"/>
     <w:basedOn w:val="SubtitleChar"/>
     <w:link w:val="FigureCaption"/>
-    <w:rsid w:val="00FC5E9F"/>
+    <w:rsid w:val="005D727E"/>
     <w:rPr>
       <w:rFonts w:ascii="Arial" w:eastAsiaTheme="majorEastAsia" w:hAnsi="Arial" w:cs="Arial"/>
       <w:b/>
@@ -20189,7 +20188,7 @@
     <w:basedOn w:val="DefaultParagraphFont"/>
     <w:uiPriority w:val="99"/>
     <w:unhideWhenUsed/>
-    <w:rsid w:val="00FC5E9F"/>
+    <w:rsid w:val="005D727E"/>
     <w:rPr>
       <w:color w:val="0000FF" w:themeColor="hyperlink"/>
       <w:u w:val="single"/>
@@ -20201,7 +20200,7 @@
     <w:uiPriority w:val="99"/>
     <w:semiHidden/>
     <w:unhideWhenUsed/>
-    <w:rsid w:val="00FC5E9F"/>
+    <w:rsid w:val="005D727E"/>
     <w:rPr>
       <w:color w:val="605E5C"/>
       <w:shd w:val="clear" w:color="auto" w:fill="E1DFDD"/>
@@ -20214,7 +20213,7 @@
     <w:autoRedefine/>
     <w:uiPriority w:val="39"/>
     <w:unhideWhenUsed/>
-    <w:rsid w:val="00FC5E9F"/>
+    <w:rsid w:val="005D727E"/>
     <w:pPr>
       <w:tabs>
         <w:tab w:val="right" w:leader="dot" w:pos="9109"/>
@@ -20235,7 +20234,7 @@
     <w:uiPriority w:val="39"/>
     <w:semiHidden/>
     <w:unhideWhenUsed/>
-    <w:rsid w:val="00FC5E9F"/>
+    <w:rsid w:val="005D727E"/>
     <w:pPr>
       <w:tabs>
         <w:tab w:val="right" w:leader="dot" w:pos="9109"/>
@@ -20257,7 +20256,7 @@
     <w:uiPriority w:val="39"/>
     <w:semiHidden/>
     <w:unhideWhenUsed/>
-    <w:rsid w:val="00FC5E9F"/>
+    <w:rsid w:val="005D727E"/>
     <w:pPr>
       <w:tabs>
         <w:tab w:val="right" w:leader="dot" w:pos="9109"/>
@@ -20279,7 +20278,7 @@
     <w:uiPriority w:val="39"/>
     <w:semiHidden/>
     <w:unhideWhenUsed/>
-    <w:rsid w:val="00FC5E9F"/>
+    <w:rsid w:val="005D727E"/>
     <w:pPr>
       <w:tabs>
         <w:tab w:val="right" w:leader="dot" w:pos="9109"/>

</xml_diff>